<commit_message>
Apply Ch16-17 fix list to merged v2 chapters
Ch16: Rohan's "same coat" and "It is ours" lines, Baju's pencil and
soft notebook planted, locker-as-memory clause, Jeebh's Kaan story
made a rumor he started, "If you are right" with a beat between,
"might never", six years / since the Initiation, safeguards line
refers back to ch13, two explaining endings cut.
Ch17: the sleeping-file exchange (Plan C plant, file meaning not
revealed), Daren's approved lines, "learn a hand", dark display,
twelve characters, ten postings, "Ashoka's Grandmaster", slip in the
coat's breast pocket, two tics fixed.
Ch20: runner's pencil copy; "You told me once this was ours."
Ch21: twelve characters (follows ch17).

Co-Authored-By: Claude Opus 5.5 <noreply@anthropic.com>
</commit_message>
<xml_diff>
--- a/claude-notes/manuscript-v2/16-then-the-fourth-instance-merged.docx
+++ b/claude-notes/manuscript-v2/16-then-the-fourth-instance-merged.docx
@@ -68,7 +68,7 @@
           <w:b w:val="0"/>
           <w:i w:val="0"/>
         </w:rPr>
-        <w:t>"And a borrowed room between the platforms would be worse." Rohan didn't slow. "An empty room protects you from people. Nothing about it protects you from systems. Two officials meeting off their routes is exactly what a watching system is built to flag." His hand brushed the rail where the stair turned, and the brass there was worn bright in one palm-sized patch by everyone else who had the same habit. "The safest place to stand is inside your own lawful shadow. You're a Drona representative conducting a procedural review with Ashoka, under the Ancient One's code. Every word of that is true, filed and boring."</w:t>
+        <w:t>"And a borrowed room between the platforms would be worse." Rohan didn't slow. "An empty room protects you from people. Nothing about it protects you from systems. Two officials meeting off their routes is exactly what a watching system is built to flag." "The safest place to stand is inside your own lawful shadow. You're a Drona representative conducting a procedural review with Ashoka, under the Ancient One's code. Every word of that is true, filed and boring."</w:t>
       </w:r>
     </w:p>
     <w:p>
@@ -113,7 +113,7 @@
           <w:b w:val="0"/>
           <w:i w:val="0"/>
         </w:rPr>
-        <w:t>Paper only. Pads on the table, pencils, a dented tin for the shavings. At the end of each session the sheets went into a locker in the inner wall, a long steel face with one key-slot for every person at the table, the keys cut fresh each time. It opened only when every key turned together. No one could take a page out alone. On no fixed days, two officers who had never been introduced swept the room by hand.</w:t>
+        <w:t>Paper only. Pads on the table, pencils, a dented tin for the shavings. At the end of each session the sheets went into a locker in the inner wall, a long steel face with one key-slot for every person at the table, the keys cut fresh each time. It opened only when every key turned together. No one could take a page out alone. The wall, Elara thought, would be the body's memory, and the locker would open only for all of them at once. On no fixed days, two officers who had never been introduced swept the room by hand.</w:t>
       </w:r>
     </w:p>
     <w:p>
@@ -165,25 +165,7 @@
           <w:b w:val="0"/>
           <w:i w:val="0"/>
         </w:rPr>
-        <w:t>"Morning." The pencil didn't stop. "I copy what I read. Dated. When a record changes overnight, I can prove it was ever different."</w:t>
-      </w:r>
-    </w:p>
-    <w:p>
-      <w:r>
-        <w:rPr>
-          <w:b w:val="0"/>
-          <w:i w:val="0"/>
-        </w:rPr>
-        <w:t>"Even those?" Elara said.</w:t>
-      </w:r>
-    </w:p>
-    <w:p>
-      <w:r>
-        <w:rPr>
-          <w:b w:val="0"/>
-          <w:i w:val="0"/>
-        </w:rPr>
-        <w:t>"Especially those. I've got dated copies of all four houses' public books. Nine years back. Nobody's ever asked me to lay them side by side." She turned the page.</w:t>
+        <w:t>"Morning." The pencil didn't stop. "I copy what I read. Dated. When a record changes overnight, I can prove it was ever different. I've got dated copies of all four houses' public books. Six years back. Nobody's ever asked me to lay them side by side." She turned the page.</w:t>
       </w:r>
     </w:p>
     <w:p>
@@ -201,7 +183,7 @@
           <w:b w:val="0"/>
           <w:i w:val="0"/>
         </w:rPr>
-        <w:t>A lean, weathered man stood against it with his palm flat on the seam where door met frame, moving his hand down a finger's width at a time, the way a physician reads a ribcage. He had a climber's hands, thick at the knuckle, two fingertips calloused flat and shiny. Something in his trouser pocket clicked when he shifted his weight.</w:t>
+        <w:t>A lean, weathered man stood against it with his palm flat on the seam where door met frame, moving his hand down a finger's width at a time, the way a physician reads a ribcage. He had a climber's hands, thick at the knuckle, two fingertips calloused flat and shiny. Something in his trouser pocket clicked when he shifted his weight, and inside his coat, where it fell open, a pencil stub rode against a notebook gone soft at the corners.</w:t>
       </w:r>
     </w:p>
     <w:p>
@@ -282,7 +264,7 @@
           <w:b w:val="0"/>
           <w:i w:val="0"/>
         </w:rPr>
-        <w:t>"And before you ask," he said, before Rohan could, "yes, he's always like that. Forty minutes in a canteen queue once, and he came out knowing which cook was watering the dal. He bought one tea." He tipped his chin at Kaan. "Jeebh. The tongue. I'm the one who talks."</w:t>
+        <w:t>"And before you ask," he said, before Rohan could, "I don't know him. Nobody does. There's a story going round the canteens this week about an ear who stood forty minutes in a tea queue and came out knowing which cook was watering the dal. I may have started it." He tipped his chin at Kaan. "Jeebh. The tongue. I'm the one who talks."</w:t>
       </w:r>
     </w:p>
     <w:p>
@@ -292,15 +274,6 @@
           <w:i w:val="0"/>
         </w:rPr>
         <w:t>Baju let out one breath through his nose, which Elara would come to understand was his laugh. Something in the air let out a notch.</w:t>
-      </w:r>
-    </w:p>
-    <w:p>
-      <w:r>
-        <w:rPr>
-          <w:b w:val="0"/>
-          <w:i w:val="0"/>
-        </w:rPr>
-        <w:t>"Jeebh talks," Rohan said. "Every true question this unit asks will travel inside a hundred dull ones he's already filed."</w:t>
       </w:r>
     </w:p>
     <w:p>
@@ -417,7 +390,7 @@
           <w:b w:val="0"/>
           <w:i w:val="0"/>
         </w:rPr>
-        <w:t>"Three instances," Rohan said. "Each one explainable alone. An error. An old authorization. A malfunction. I was charged to test what you see, and to act when the evidence requires it. So test it. All of you. What makes these one thing and not three?"</w:t>
+        <w:t>"Three instances," Rohan said. "Each one explainable alone. An error. An old authorization. A malfunction. I was charged to test what you see, and to act when the evidence requires it. So test it. All of you. This is not your case with my help. It is ours. What makes these one thing and not three?"</w:t>
       </w:r>
     </w:p>
     <w:p>
@@ -471,7 +444,7 @@
           <w:b w:val="0"/>
           <w:i w:val="0"/>
         </w:rPr>
-        <w:t>For nine days she had been watching one narrow band: cross-house allocations, the entries where one gana's money paid for another gana's wants. This hand gave before it took. So she watched for gifts arriving where no gift had ever gone. Generosity had become her tripwire.</w:t>
+        <w:t>Since the Initiation she had been watching one narrow band: cross-house allocations, the entries where one gana's money paid for another gana's wants. This hand gave before it took. So she watched for gifts arriving where no gift had ever gone. Generosity had become her tripwire.</w:t>
       </w:r>
     </w:p>
     <w:p>
@@ -534,7 +507,7 @@
           <w:b w:val="0"/>
           <w:i w:val="0"/>
         </w:rPr>
-        <w:t>Elara came around the table. "I know this petition." They looked at her. "It lives in my band. Chanakya has petitioned for that expansion every cycle for eleven years. Kubera has refused it every cycle for eleven years. It was the stillest water I had."</w:t>
+        <w:t>Elara came around the table. "I know this petition. It lives in my band. Chanakya has petitioned for that expansion every cycle for eleven years. Kubera has refused it every cycle for eleven years. It was the stillest water I had."</w:t>
       </w:r>
     </w:p>
     <w:p>
@@ -561,7 +534,7 @@
           <w:b w:val="0"/>
           <w:i w:val="0"/>
         </w:rPr>
-        <w:t>She had caught that analyst's wrist once, at the Initiation consoles, when his hand went toward the High Command button. Across the table Rohan's eyes came up and found hers, held, and went back to the bulletin. Neither of them said that the name had sat at the EVENT console close enough to touch.</w:t>
+        <w:t>She had caught that analyst's wrist once, at the Initiation consoles, when his hand went toward the High Command button. Across the table Rohan's eyes came up and found hers, held, and went back to the bulletin. Neither of them said that the name had sat at the EVENT console close enough to touch. Kaan would have to watch the man without a story already hung on him.</w:t>
       </w:r>
     </w:p>
     <w:p>
@@ -624,7 +597,7 @@
           <w:b w:val="0"/>
           <w:i w:val="0"/>
         </w:rPr>
-        <w:t>Elara opened her mouth and closed it. Heat climbed the back of her neck. A picture drawn early was its own kind of altered record.</w:t>
+        <w:t>Elara opened her mouth and closed it. Heat climbed the back of her neck.</w:t>
       </w:r>
     </w:p>
     <w:p>
@@ -642,7 +615,30 @@
           <w:b w:val="0"/>
           <w:i w:val="0"/>
         </w:rPr>
-        <w:t>"Then the pattern has a fourth instance," Rohan said. "And look at the date. The first three happened weeks and months ago. This one happened this morning, while we were pinning the other three to a wall." His jaw worked once along the old scar. "We came here to read history. This is not history. It is traffic. It is still moving."</w:t>
+        <w:t xml:space="preserve">Elara nodded once. Her pencil went back to the pad and wrote </w:t>
+      </w:r>
+      <w:r>
+        <w:rPr>
+          <w:b w:val="0"/>
+          <w:i/>
+        </w:rPr>
+        <w:t>it</w:t>
+      </w:r>
+      <w:r>
+        <w:rPr>
+          <w:b w:val="0"/>
+          <w:i w:val="0"/>
+        </w:rPr>
+        <w:t>.</w:t>
+      </w:r>
+    </w:p>
+    <w:p>
+      <w:r>
+        <w:rPr>
+          <w:b w:val="0"/>
+          <w:i w:val="0"/>
+        </w:rPr>
+        <w:t>"If you are right," Rohan said, "then the pattern has a fourth instance. And look at the date. The first three happened weeks and months ago. This one happened this morning, while we were pinning the other three to a wall." His jaw worked once along the old scar. "We came here to read history. This is not history. It is traffic. It is still moving."</w:t>
       </w:r>
     </w:p>
     <w:p>
@@ -714,7 +710,7 @@
           <w:b w:val="0"/>
           <w:i w:val="0"/>
         </w:rPr>
-        <w:t>Kaan had already moved a half-step toward the door. That was his answer. Elara realized she still didn't know what his voice sounded like, and now she never would.</w:t>
+        <w:t>Kaan had already moved a half-step toward the door. Elara realized she still didn't know what his voice sounded like, and might never.</w:t>
       </w:r>
     </w:p>
     <w:p>
@@ -733,6 +729,15 @@
           <w:i w:val="0"/>
         </w:rPr>
         <w:t>"Three sub-audits." Jeebh laced his fingers behind his head. "I'll make them so dull I fall asleep filing them. The rumor I'll enjoy."</w:t>
+      </w:r>
+    </w:p>
+    <w:p>
+      <w:r>
+        <w:rPr>
+          <w:b w:val="0"/>
+          <w:i w:val="0"/>
+        </w:rPr>
+        <w:t>"The hand's whole art is dressing the extraordinary as the ordinary," Rohan said. "A theft as a gift. An order as a habit. From now on, we wear the same coat."</w:t>
       </w:r>
     </w:p>
     <w:p>
@@ -858,7 +863,7 @@
           <w:b w:val="0"/>
           <w:i w:val="0"/>
         </w:rPr>
-        <w:t>"There is one more thing," she said. "You hunt a hand that hides in lawful shadows. You may find ground that has already been walked, questions answered before you ask them. There are safeguards in this city older than Ashoka, and they do not report to me. If your hunt ever crosses a path that feels like your own thinking arriving ahead of you, do not chase it. Mark the place, and bring it to me, and I will tell you what I can, which will not be everything."</w:t>
+        <w:t>"There is one more thing," she said. "You hunt a hand that hides in lawful shadows. You may find ground that has already been walked, questions answered before you ask them. I told you there are safeguards in this city older than Ashoka. They do not report to me. If your hunt ever crosses a path that feels like your own thinking arriving ahead of you, do not chase it. Mark the place, and bring it to me, and I will tell you what I can, which will not be everything."</w:t>
       </w:r>
     </w:p>
     <w:p>

</xml_diff>

<commit_message>
Ch16 round 2: Ravi near-slip on the page; locker, safeguards and Kaan fixes
Co-Authored-By: Claude Opus 5.5 <noreply@anthropic.com>
</commit_message>
<xml_diff>
--- a/claude-notes/manuscript-v2/16-then-the-fourth-instance-merged.docx
+++ b/claude-notes/manuscript-v2/16-then-the-fourth-instance-merged.docx
@@ -73,7 +73,17 @@
           <w:i w:val="0"/>
           <w:strike w:val="0"/>
         </w:rPr>
-        <w:t>"And a borrowed room between the platforms would be worse." Rohan didn't slow. "An empty room protects you from people. Nothing about it protects you from systems. Two officials meeting off their routes is exactly what a watching system is built to flag." "The safest place to stand is inside your own lawful shadow. You're a Drona representative conducting a procedural review with Ashoka, under the Ancient One's code. Every word of that is true, filed and boring."</w:t>
+        <w:t>"And a borrowed room between the platforms would be worse." Rohan didn't slow. "An empty room protects you from people. Nothing about it protects you from systems. Two officials meeting off their routes is exactly what a watching system is built to flag."</w:t>
+      </w:r>
+    </w:p>
+    <w:p>
+      <w:r>
+        <w:rPr>
+          <w:b w:val="0"/>
+          <w:i w:val="0"/>
+          <w:strike w:val="0"/>
+        </w:rPr>
+        <w:t>"The safest place to stand is inside your own lawful shadow. You're a Drona representative conducting a procedural review with Ashoka, under the Ancient One's code."</w:t>
       </w:r>
     </w:p>
     <w:p>
@@ -103,7 +113,7 @@
           <w:i w:val="0"/>
           <w:strike w:val="0"/>
         </w:rPr>
-        <w:t>Ashoka called it a dead room, and the words were painted on the door in plain white, because the room was lawful and had nothing to hide about having nothing. It was older than the present Grandmaster, kept for witness protection and planning: no recording lamps, no wall sensors, no network thread entering it anywhere. What light it had came down a shaft in the ceiling, daylight bent through three polished mirrors from somewhere far above. It arrived pale and a little late. When a cloud crossed the platforms, the room dimmed a few seconds after the sky did.</w:t>
+        <w:t>Ashoka called it a dead room, and the words were painted on the door in plain white, because the room was lawful and had nothing in it to hide. It was older than the present Grandmaster, kept for witness protection and planning: no recording lamps, no wall sensors, no network thread entering it anywhere. What light it had came down a shaft in the ceiling, daylight bent through three polished mirrors from somewhere far above. It arrived pale and a little late. When a cloud crossed the platforms, the room dimmed a few seconds after the sky did.</w:t>
       </w:r>
     </w:p>
     <w:p>
@@ -123,7 +133,7 @@
           <w:i w:val="0"/>
           <w:strike w:val="0"/>
         </w:rPr>
-        <w:t>Paper only. Pads on the table, pencils, a dented tin for the shavings. At the end of each session the sheets went into a locker in the inner wall, a long steel face with one key-slot for every person at the table, the keys cut fresh each time. It opened only when every key turned together. No one could take a page out alone. The wall, Elara thought, would be the body's memory, and the locker would open only for all of them at once. On no fixed days, two officers who had never been introduced swept the room by hand.</w:t>
+        <w:t>Paper only. Pads on the table, pencils, a dented tin for the shavings. At the end of each session the sheets went into a locker in the inner wall, a long steel face with two key-slots, Rohan's and the room keeper's, the keys cut fresh each time. No one could take a page out alone. The wall, Elara thought, would be the body's memory. On no fixed days, two officers who had never been introduced swept the room by hand.</w:t>
       </w:r>
     </w:p>
     <w:p>
@@ -201,7 +211,7 @@
           <w:i w:val="0"/>
           <w:strike w:val="0"/>
         </w:rPr>
-        <w:t>A lean, weathered man stood against it with his palm flat on the seam where door met frame, moving his hand down a finger's width at a time, the way a physician reads a ribcage. He had a climber's hands, thick at the knuckle, two fingertips calloused flat and shiny. Something in his trouser pocket clicked when he shifted his weight, and inside his coat, where it fell open, a pencil stub rode against a notebook gone soft at the corners.</w:t>
+        <w:t>A lean, weathered man stood against it with his palm flat on the seam where door met frame, moving his hand down a finger's width at a time, feeling for give. He had a climber's hands, thick at the knuckle, two fingertips calloused flat and shiny. Something in his trouser pocket clicked when he shifted his weight, and inside his coat, where it fell open, a pencil stub rode against a notebook gone soft at the corners.</w:t>
       </w:r>
     </w:p>
     <w:p>
@@ -221,7 +231,7 @@
           <w:i w:val="0"/>
           <w:strike w:val="0"/>
         </w:rPr>
-        <w:t>"Seal's good." Baju took his hand off the door and wiped it on his trousers, though there was nothing on it. "Field work. Doors, lifts, platforms. I walk what the logs say was walked, and I count." He patted the pocket. It clicked again. "Machines can be told what to remember. Floors cannot be told what to remember."</w:t>
+        <w:t>"Seal's good." Baju took his hand off the door and wiped it on his trousers, though there was nothing on it. "Field work. Doors, lifts, platforms. I walk what the logs say was walked, and I count." He patted the pocket. It clicked again. "Machines can be told what to remember."</w:t>
       </w:r>
     </w:p>
     <w:p>
@@ -251,7 +261,7 @@
           <w:i w:val="0"/>
           <w:strike w:val="0"/>
         </w:rPr>
-        <w:t>Elara had set her pad down within an arm's length of him, and her eyes had gone over that corner and registered a wall. Medium height, medium build, a face like an unmarked door.</w:t>
+        <w:t>Elara had set her pad down within an arm's length of him, and her eyes had gone over that corner and registered a wall. Medium height, medium build, a face that gave nothing to remember.</w:t>
       </w:r>
     </w:p>
     <w:p>
@@ -261,7 +271,7 @@
           <w:i w:val="0"/>
           <w:strike w:val="0"/>
         </w:rPr>
-        <w:t>"He takes up a cover posting tomorrow," Rohan said. "Even I'll know only which building. He asks no questions. He receives."</w:t>
+        <w:t>"He takes up a cover posting tomorrow, wherever I point him," Rohan said. "He asks no questions. He receives."</w:t>
       </w:r>
     </w:p>
     <w:p>
@@ -281,7 +291,7 @@
           <w:i w:val="0"/>
           <w:strike w:val="0"/>
         </w:rPr>
-        <w:t>The last of them had his chair tipped back on two legs and his boots crossed at the ankle. He was broad and open-faced, with a market trader's ease, and he sat in the dead room as if it were his stall on a slow afternoon.</w:t>
+        <w:t>The last of them had his chair tipped back on two legs and his boots crossed at the ankle. He was broad and open-faced, with a market trader's ease.</w:t>
       </w:r>
     </w:p>
     <w:p>
@@ -321,7 +331,7 @@
           <w:i w:val="0"/>
           <w:strike w:val="0"/>
         </w:rPr>
-        <w:t>"They don't know each other's true names," Rohan said. "Or their units. To each other they're the eye, the arm, the ear and the tongue. If one of them is caught, or turned, the other three stay strangers to whoever's holding him. No one can surrender what they were never given."</w:t>
+        <w:t>"They don't know each other's true names," Rohan said. "Or their units. To each other they're the eye, the arm, the ear and the tongue. If one of them is caught, or turned, the other three stay strangers to whoever's holding him."</w:t>
       </w:r>
     </w:p>
     <w:p>
@@ -351,7 +361,7 @@
           <w:i w:val="0"/>
           <w:strike w:val="0"/>
         </w:rPr>
-        <w:t>"One more rule, and it's yours. After today you will not see these four again. You will not meet them, signal them or task them. Everything goes through me. A body has one will. If it had two, it could be pulled apart at the joint."</w:t>
+        <w:t>"One more rule, and it's yours. After today you will not see these four again. You will not meet them, signal them or task them. Everything goes through me. A body has one will."</w:t>
       </w:r>
     </w:p>
     <w:p>
@@ -381,7 +391,7 @@
           <w:i w:val="0"/>
           <w:strike w:val="0"/>
         </w:rPr>
-        <w:t>"And if it finds one of them, they can give it nothing but me." Rohan nodded once. "I am the only door in this body. And a door is the one part of the house that is built to take the breaking."</w:t>
+        <w:t>"And if it finds one of them, they can give it nothing but me." Rohan nodded once. "I am the only door."</w:t>
       </w:r>
     </w:p>
     <w:p>
@@ -481,7 +491,7 @@
           <w:i w:val="0"/>
           <w:strike w:val="0"/>
         </w:rPr>
-        <w:t>She had brought her own instrument to the work. The Sākṣī mirrors were witness copies, duplicates of the city's records written into a separate archive by hands that had no part in making the originals. A record could be altered. Its mirror, held somewhere else by someone else, remembered what it used to say. Anandi had taught her to read them.</w:t>
+        <w:t>She had brought her own instrument: the Sākṣī mirrors, witness copies of the city's records, kept in a separate archive by hands that had no part in the originals. Anandi had taught her to read them. An altered record could be checked against its mirror, which still held what the original used to say.</w:t>
       </w:r>
     </w:p>
     <w:p>
@@ -491,7 +501,7 @@
           <w:i w:val="0"/>
           <w:strike w:val="0"/>
         </w:rPr>
-        <w:t>Since the Initiation she had been watching one narrow band: cross-house allocations, the entries where one gana's money paid for another gana's wants. This hand gave before it took. So she watched for gifts arriving where no gift had ever gone. Generosity had become her tripwire.</w:t>
+        <w:t>Since the Initiation she had been watching one narrow band: cross-house allocations, the entries where one gana's money paid for another gana's wants. The doubled transfer had come through there. So she watched for money arriving where nobody had asked for it.</w:t>
       </w:r>
     </w:p>
     <w:p>
@@ -501,7 +511,7 @@
           <w:i w:val="0"/>
           <w:strike w:val="0"/>
         </w:rPr>
-        <w:t>Her terminal sat in the locker by the door, and it made no difference. Nayan had been watching the same water.</w:t>
+        <w:t>Her terminal sat in the locker by the door. She hadn't needed it. Nayan had been watching the same water on paper.</w:t>
       </w:r>
     </w:p>
     <w:p>
@@ -571,7 +581,7 @@
           <w:i w:val="0"/>
           <w:strike w:val="0"/>
         </w:rPr>
-        <w:t>"The council acted on a memorandum," Nayan said. "Cost of Chanakya's retrieval delays. Signed by an analyst named Ravi." She checked the sheet. "Bulletin calls it exemplary. Every figure sourced. Every objection anticipated. Eleven years of refusal answered in nine pages."</w:t>
+        <w:t>"The council acted on a memorandum," Nayan said. "Cost of Chanakya's retrieval delays. Signed by an analyst named Ravi. EVENT rotation, last Initiation." She checked the sheet. "Bulletin calls it exemplary. Every figure sourced. Every objection anticipated. Eleven years of refusal answered in nine pages."</w:t>
       </w:r>
     </w:p>
     <w:p>
@@ -591,7 +601,7 @@
           <w:i w:val="0"/>
           <w:strike w:val="0"/>
         </w:rPr>
-        <w:t>She had caught that analyst's wrist once, at the Initiation consoles, when his hand went toward the High Command button. Across the table Rohan's eyes came up and found hers, held, and went back to the bulletin. Neither of them said that the name had sat at the EVENT console close enough to touch. Kaan would have to watch the man without a story already hung on him.</w:t>
+        <w:t>She had caught that analyst's wrist once, at the Initiation consoles, when his hand went toward the High Command button.</w:t>
       </w:r>
     </w:p>
     <w:p>
@@ -601,7 +611,63 @@
           <w:i w:val="0"/>
           <w:strike w:val="0"/>
         </w:rPr>
-        <w:t>"Houses change their minds," Baju said. It didn't sound like disagreement. It sounded like a man tapping the ice with his heel before the others walked on it.</w:t>
+        <w:t xml:space="preserve">Her lips had parted on </w:t>
+      </w:r>
+      <w:r>
+        <w:rPr>
+          <w:b w:val="0"/>
+          <w:i/>
+          <w:strike w:val="0"/>
+        </w:rPr>
+        <w:t>I know him</w:t>
+      </w:r>
+      <w:r>
+        <w:rPr>
+          <w:b w:val="0"/>
+          <w:i w:val="0"/>
+          <w:strike w:val="0"/>
+        </w:rPr>
+        <w:t>. Rohan's hand came down flat on the face-down sheet.</w:t>
+      </w:r>
+    </w:p>
+    <w:p>
+      <w:r>
+        <w:rPr>
+          <w:b w:val="0"/>
+          <w:i w:val="0"/>
+          <w:strike w:val="0"/>
+        </w:rPr>
+        <w:t>"Kaan watches him clean," he said. "Whatever any of us thinks we know."</w:t>
+      </w:r>
+    </w:p>
+    <w:p>
+      <w:r>
+        <w:rPr>
+          <w:b w:val="0"/>
+          <w:i w:val="0"/>
+          <w:strike w:val="0"/>
+        </w:rPr>
+        <w:t>Nayan's pencil paused, and went on. The eye had seen the look.</w:t>
+      </w:r>
+    </w:p>
+    <w:p>
+      <w:r>
+        <w:rPr>
+          <w:b w:val="0"/>
+          <w:i w:val="0"/>
+          <w:strike w:val="0"/>
+        </w:rPr>
+        <w:t>Elara closed her mouth on the name and sat back. Her thumb found the dent it had made in the pad. An hour ago the rule had cost her nothing.</w:t>
+      </w:r>
+    </w:p>
+    <w:p>
+      <w:r>
+        <w:rPr>
+          <w:b w:val="0"/>
+          <w:i w:val="0"/>
+          <w:strike w:val="0"/>
+        </w:rPr>
+        <w:t>"Houses change their minds," Baju said. He didn't sound as if he believed it. He sounded as if he wanted it tested.</w:t>
       </w:r>
     </w:p>
     <w:p>
@@ -621,7 +687,7 @@
           <w:i w:val="0"/>
           <w:strike w:val="0"/>
         </w:rPr>
-        <w:t>"Maybe." Elara tapped the bulletin. "I've read years of petitions in that band. Here's what's wrong with this one. It is perfect. A petition refused eleven years running carries scars. Each refiling trims an ask, concedes a point, answers last cycle's objection in the margin. Every defeat stays in the text, like rings in a tree." She looked at the wall. "This memorandum has no rings. Drona was given more money than it asked for. Now Kubera gives Chanakya the thing it stopped hoping for aloud. Generosity is the fingerprint. Whoever he is, he doesn't attack houses. He feeds them."</w:t>
+        <w:t>"Maybe." Elara tapped the bulletin. "I've read years of petitions in that band. Here's what's wrong with this one. It is perfect. A petition refused eleven years running carries scars. Each refiling trims an ask, concedes a point, answers last cycle's objection in the margin. Every defeat stays in the text, like rings in a tree." She looked at the wall. "This memorandum has no rings. Drona was given more money than it asked for. Now Kubera gives Chanakya the thing it stopped hoping for aloud. Generosity is the fingerprint. The calibration is the one that gives nothing, which is why it bothers me most. Whoever he is, he doesn't attack houses. He feeds them."</w:t>
       </w:r>
     </w:p>
     <w:p>
@@ -707,7 +773,7 @@
           <w:i w:val="0"/>
           <w:strike w:val="0"/>
         </w:rPr>
-        <w:t>"If you are right," Rohan said, "then the pattern has a fourth instance. And look at the date. The first three happened weeks and months ago. This one happened this morning, while we were pinning the other three to a wall." His jaw worked once along the old scar. "We came here to read history. This is not history. It is traffic. It is still moving."</w:t>
+        <w:t>"If you are right," Rohan said, "then the pattern has a fourth instance. And look at the date. The first three happened weeks and months ago. This one happened this morning, while we were pinning the other three to a wall." His jaw worked once along the old scar. "We came here to read history. This is traffic. It is still moving."</w:t>
       </w:r>
     </w:p>
     <w:p>
@@ -877,7 +943,7 @@
           <w:i w:val="0"/>
           <w:strike w:val="0"/>
         </w:rPr>
-        <w:t>He reported the way he fought, with nothing wasted. The dead room. The wall and its four panels. The body, by its working names only: the eye, the arm, the ear, the tongue, and the rule that made him its single door. Last, the bulletin. Same direction, same disguise, same perfection. Generosity as the fingerprint.</w:t>
+        <w:t>He reported the way he fought, with nothing wasted. Last, the bulletin.</w:t>
       </w:r>
     </w:p>
     <w:p>
@@ -887,7 +953,7 @@
           <w:i w:val="0"/>
           <w:strike w:val="0"/>
         </w:rPr>
-        <w:t>A body that answered to no Grandmaster would make him the thing he was hunting, so he told her everything but its faces. Even here, the door held.</w:t>
+        <w:t>She had chosen the four. She did not know which was the eye and which the tongue, and he kept it that way. Even here, the door held.</w:t>
       </w:r>
     </w:p>
     <w:p>
@@ -897,7 +963,7 @@
           <w:i w:val="0"/>
           <w:strike w:val="0"/>
         </w:rPr>
-        <w:t>The Dhammapala listened with her eyes closed, which in her meant the reverse of inattention. One hand rested on her knee with the fingers curled, the way they had closed on the bamboo.</w:t>
+        <w:t>The Dhammapala listened with her eyes closed, which in her meant the reverse of inattention. One hand rested on her knee with the fingers curled.</w:t>
       </w:r>
     </w:p>
     <w:p>
@@ -927,7 +993,7 @@
           <w:i w:val="0"/>
           <w:strike w:val="0"/>
         </w:rPr>
-        <w:t>"Good. The mind hunts what the mouth names." She opened her eyes. "And you are the only door. You have built a body whose whole safety is one man's silence. What happens to the hunt when the door is broken down?"</w:t>
+        <w:t>"Good." She opened her eyes. "And you are the only door. You have built a body whose whole safety is one man's silence. What happens to the hunt when the door is broken down?"</w:t>
       </w:r>
     </w:p>
     <w:p>
@@ -947,7 +1013,7 @@
           <w:i w:val="0"/>
           <w:strike w:val="0"/>
         </w:rPr>
-        <w:t>"That is the answer of a man who has made peace with being spent." She said it without praise and without objection, the way she might name a stance. "I will not unmake it. But hear one thing from someone older than your certainty. A door that is willing to break serves the house. A door that is eager to break serves only its own story. Watch which one you are becoming. The first keeps people alive. The second is merely brave."</w:t>
+        <w:t>"That is the answer of a man who has made peace with being spent." She said it without praise and without objection. "I will not unmake it. But hear one thing from someone older than your certainty. A door that is willing to break serves the house. A door that is eager to break serves only its own story. Watch which one you are becoming. The first keeps people alive. The second is merely brave."</w:t>
       </w:r>
     </w:p>
     <w:p>
@@ -967,7 +1033,7 @@
           <w:i w:val="0"/>
           <w:strike w:val="0"/>
         </w:rPr>
-        <w:t>"There is one more thing," she said. "You hunt a hand that hides in lawful shadows. You may find ground that has already been walked, questions answered before you ask them. I told you there are safeguards in this city older than Ashoka. They do not report to me. If your hunt ever crosses a path that feels like your own thinking arriving ahead of you, do not chase it. Mark the place, and bring it to me, and I will tell you what I can, which will not be everything."</w:t>
+        <w:t>"There is one more thing," she said. "You hunt a hand that hides in lawful shadows. You may find ground that has already been walked, questions answered before you ask them. There are safeguards in this city older than Ashoka. They do not report to me. If your hunt ever crosses a path that feels like your own thinking arriving ahead of you, do not chase it. Mark the place, and bring it to me, and I will tell you what I can, which will not be everything."</w:t>
       </w:r>
     </w:p>
     <w:p>
@@ -987,7 +1053,7 @@
           <w:i w:val="0"/>
           <w:strike w:val="0"/>
         </w:rPr>
-        <w:t>"If the balance is kind," the Dhammapala said, rising, "you will never need to know."</w:t>
+        <w:t>"If the balance is kind," the Dhammapala said, rising, "you will never need to know what they are."</w:t>
       </w:r>
     </w:p>
     <w:p>

</xml_diff>

<commit_message>
Ch16 round 3: Elara's objection out loud; split voices; sheet paid off at the lamp
Co-Authored-By: Claude Opus 5.5 <noreply@anthropic.com>
</commit_message>
<xml_diff>
--- a/claude-notes/manuscript-v2/16-then-the-fourth-instance-merged.docx
+++ b/claude-notes/manuscript-v2/16-then-the-fourth-instance-merged.docx
@@ -73,17 +73,7 @@
           <w:i w:val="0"/>
           <w:strike w:val="0"/>
         </w:rPr>
-        <w:t>"And a borrowed room between the platforms would be worse." Rohan didn't slow. "An empty room protects you from people. Nothing about it protects you from systems. Two officials meeting off their routes is exactly what a watching system is built to flag."</w:t>
-      </w:r>
-    </w:p>
-    <w:p>
-      <w:r>
-        <w:rPr>
-          <w:b w:val="0"/>
-          <w:i w:val="0"/>
-          <w:strike w:val="0"/>
-        </w:rPr>
-        <w:t>"The safest place to stand is inside your own lawful shadow. You're a Drona representative conducting a procedural review with Ashoka, under the Ancient One's code."</w:t>
+        <w:t>"And a borrowed room between the platforms would be worse." Rohan didn't slow. "An empty room protects you from people. Nothing about it protects you from systems. Two officials meeting off their routes is exactly what a watching system is built to flag. The safest place to stand is inside your own lawful shadow. You're a Drona representative conducting a procedural review with Ashoka, under the Ancient One's code."</w:t>
       </w:r>
     </w:p>
     <w:p>
@@ -123,7 +113,7 @@
           <w:i w:val="0"/>
           <w:strike w:val="0"/>
         </w:rPr>
-        <w:t>Beside the door stood a grey steel locker with a slot for each wrist. Elara unbuckled her terminal and laid it in, and the drawer closed on it with a soft pneumatic sigh. The skin where it had sat was paler than the rest of her arm, and cold. The city couldn't hear her.</w:t>
+        <w:t>Beside the door stood a grey steel locker with a slot for each wrist. Five other terminals already lay in their slots. Elara unbuckled hers and laid it in, and the drawer closed on it with a soft pneumatic sigh. The skin where it had sat was paler than the rest of her arm, and cold. The city couldn't hear her.</w:t>
       </w:r>
     </w:p>
     <w:p>
@@ -133,7 +123,7 @@
           <w:i w:val="0"/>
           <w:strike w:val="0"/>
         </w:rPr>
-        <w:t>Paper only. Pads on the table, pencils, a dented tin for the shavings. At the end of each session the sheets went into a locker in the inner wall, a long steel face with two key-slots, Rohan's and the room keeper's, the keys cut fresh each time. No one could take a page out alone. The wall, Elara thought, would be the body's memory. On no fixed days, two officers who had never been introduced swept the room by hand.</w:t>
+        <w:t>Paper only. Pads on the table, pencils, a dented tin for the shavings. At the end of each session the sheets went into a locker in the inner wall, a long steel face with two key-slots, Rohan's and the room keeper's, the keys cut fresh each time. No one could take a page out alone. The wall, Elara thought, would be the room's only memory. On no fixed days, two officers who had never been introduced swept the room by hand.</w:t>
       </w:r>
     </w:p>
     <w:p>
@@ -301,7 +291,7 @@
           <w:i w:val="0"/>
           <w:strike w:val="0"/>
         </w:rPr>
-        <w:t>"And before you ask," he said, before Rohan could, "I don't know him. Nobody does. There's a story going round the canteens this week about an ear who stood forty minutes in a tea queue and came out knowing which cook was watering the dal. I may have started it." He tipped his chin at Kaan. "Jeebh. The tongue. I'm the one who talks."</w:t>
+        <w:t>"And before you ask," he said, before Rohan could, "I don't know him. Nobody does. There's a story going round the canteens this week about an ear who stood forty minutes in a tea queue and came out knowing which cook was watering the dal. Not ours, obviously. I may have started it." He tipped his chin at Kaan. "Jeebh. The tongue. I'm the one who talks."</w:t>
       </w:r>
     </w:p>
     <w:p>
@@ -311,7 +301,7 @@
           <w:i w:val="0"/>
           <w:strike w:val="0"/>
         </w:rPr>
-        <w:t>Baju let out one breath through his nose, which Elara would come to understand was his laugh. Something in the air let out a notch.</w:t>
+        <w:t>Baju let out one breath through his nose. She was slow to place it as a laugh. Something in the air let out a notch.</w:t>
       </w:r>
     </w:p>
     <w:p>
@@ -331,7 +321,7 @@
           <w:i w:val="0"/>
           <w:strike w:val="0"/>
         </w:rPr>
-        <w:t>"They don't know each other's true names," Rohan said. "Or their units. To each other they're the eye, the arm, the ear and the tongue. If one of them is caught, or turned, the other three stay strangers to whoever's holding him."</w:t>
+        <w:t>"They don't know each other's true names," Rohan said. "Or their units. To each other they're the eye, the arm, the ear and the tongue, and the four together are the body. This is the only hour they'll ever share a room. After today, if one is caught, all they can give up is three faces, three nicknames, and me."</w:t>
       </w:r>
     </w:p>
     <w:p>
@@ -361,7 +351,7 @@
           <w:i w:val="0"/>
           <w:strike w:val="0"/>
         </w:rPr>
-        <w:t>"One more rule, and it's yours. After today you will not see these four again. You will not meet them, signal them or task them. Everything goes through me. A body has one will."</w:t>
+        <w:t>"One more rule, and it's yours. After today you will not see these four again. You will not meet them, signal them or task them. Everything goes through me. No exceptions."</w:t>
       </w:r>
     </w:p>
     <w:p>
@@ -371,7 +361,7 @@
           <w:i w:val="0"/>
           <w:strike w:val="0"/>
         </w:rPr>
-        <w:t>The objection came up in her like heat. She had always trusted her own eyes over anyone's summary. Her thumb pressed into the soft edge of the pad until it dented. Then the argument finished itself, because it was the same arithmetic that kept everyone at the table alive.</w:t>
+        <w:t>"I don't work from summaries." It came out hotter than she meant. "I never have."</w:t>
       </w:r>
     </w:p>
     <w:p>
@@ -381,7 +371,7 @@
           <w:i w:val="0"/>
           <w:strike w:val="0"/>
         </w:rPr>
-        <w:t>"So if the hand ever finds me," she said, "I can give it nothing but you."</w:t>
+        <w:t>"Then work from one." Rohan didn't raise his voice. "If the hand finds you, what do you want in your head?"</w:t>
       </w:r>
     </w:p>
     <w:p>
@@ -391,7 +381,17 @@
           <w:i w:val="0"/>
           <w:strike w:val="0"/>
         </w:rPr>
-        <w:t>"And if it finds one of them, they can give it nothing but me." Rohan nodded once. "I am the only door."</w:t>
+        <w:t>Her thumb pressed into the soft edge of the pad until it dented. She didn't answer, which was the answer.</w:t>
+      </w:r>
+    </w:p>
+    <w:p>
+      <w:r>
+        <w:rPr>
+          <w:b w:val="0"/>
+          <w:i w:val="0"/>
+          <w:strike w:val="0"/>
+        </w:rPr>
+        <w:t>"If it finds you, all you have is me," Rohan said. "If it finds one of them, all they have is me. I am the only door."</w:t>
       </w:r>
     </w:p>
     <w:p>
@@ -697,6 +697,26 @@
           <w:i w:val="0"/>
           <w:strike w:val="0"/>
         </w:rPr>
+        <w:t>"Then it isn't one thing," Nayan said.</w:t>
+      </w:r>
+    </w:p>
+    <w:p>
+      <w:r>
+        <w:rPr>
+          <w:b w:val="0"/>
+          <w:i w:val="0"/>
+          <w:strike w:val="0"/>
+        </w:rPr>
+        <w:t>"Or the calibration is the one we don't understand yet," Elara said.</w:t>
+      </w:r>
+    </w:p>
+    <w:p>
+      <w:r>
+        <w:rPr>
+          <w:b w:val="0"/>
+          <w:i w:val="0"/>
+          <w:strike w:val="0"/>
+        </w:rPr>
         <w:t>"He," Nayan said.</w:t>
       </w:r>
     </w:p>
@@ -737,7 +757,7 @@
           <w:i w:val="0"/>
           <w:strike w:val="0"/>
         </w:rPr>
-        <w:t>"Nayan is right," Rohan said. "The word you use shapes the thing you look for. Say he, and every woman in the city walks past your watch unexamined. From today, inside this room, it is the hand. It."</w:t>
+        <w:t>"Nayan is right," Rohan said. "Say he, and every woman in the city walks past your watch unexamined. From today, inside this room, it is the hand. It."</w:t>
       </w:r>
     </w:p>
     <w:p>
@@ -833,7 +853,7 @@
           <w:i w:val="0"/>
           <w:strike w:val="0"/>
         </w:rPr>
-        <w:t>"And if nothing bent," Baju said, "that's worse news, and I'll have walked a long way to bring it."</w:t>
+        <w:t>"Four instances, six days either side of each. Forty-eight days of door logs," Baju said. "Two weeks to walk them. If nothing bent, that's the worse answer."</w:t>
       </w:r>
     </w:p>
     <w:p>
@@ -883,7 +903,7 @@
           <w:i w:val="0"/>
           <w:strike w:val="0"/>
         </w:rPr>
-        <w:t>"The hand's whole art is dressing the extraordinary as the ordinary," Rohan said. "A theft as a gift. An order as a habit. From now on, we wear the same coat."</w:t>
+        <w:t>"The hand's whole art is dressing the extraordinary as the ordinary," Rohan said. "A theft as a gift. An order as a habit. Whatever you do tomorrow, make sure it looks like nothing."</w:t>
       </w:r>
     </w:p>
     <w:p>
@@ -893,7 +913,7 @@
           <w:i w:val="0"/>
           <w:strike w:val="0"/>
         </w:rPr>
-        <w:t>Rohan turned the face-down sheet over, wrote one line on it in his own hand, and turned it back. "The eye cannot seize. The arm cannot hear. The ear cannot speak. Together, you're a net. I brief the Grandmaster tonight." Then he nodded at the bulletin.</w:t>
+        <w:t>Rohan turned the face-down sheet over, wrote one line on it in his own hand, folded it once and put it inside his coat. The wall locker would not get that one. "I brief the Grandmaster tonight." Then he nodded at the bulletin.</w:t>
       </w:r>
     </w:p>
     <w:p>
@@ -1033,7 +1053,7 @@
           <w:i w:val="0"/>
           <w:strike w:val="0"/>
         </w:rPr>
-        <w:t>"There is one more thing," she said. "You hunt a hand that hides in lawful shadows. You may find ground that has already been walked, questions answered before you ask them. There are safeguards in this city older than Ashoka. They do not report to me. If the balance is kind, you will never need to know what they are. If your hunt ever crosses a path that feels like your own thinking arriving ahead of you, do not chase it. Mark the place, and bring it to me, and I will tell you what I can, which will not be everything."</w:t>
+        <w:t>"There is one more thing," she said. "You hunt a hand that hides in lawful shadows. You may find ground that has already been walked, questions answered before you ask them. There are safeguards in this city older than Ashoka. They do not report to me. If your hunt ever crosses a path that feels like your own thinking arriving ahead of you, do not chase it. Mark the place, and bring it to me, and I will tell you what I can, which will not be everything."</w:t>
       </w:r>
     </w:p>
     <w:p>
@@ -1063,7 +1083,15 @@
           <w:i w:val="0"/>
           <w:strike w:val="0"/>
         </w:rPr>
-        <w:t>There was a who, then, and she knew some of it. Rohan found he could live without knowing. He hoped he would be allowed to.</w:t>
+        <w:t xml:space="preserve">Rohan took the folded sheet from inside his coat and held it up to her. She unfolded it and read it by the lamp. One line, in his hand: </w:t>
+      </w:r>
+      <w:r>
+        <w:rPr>
+          <w:b w:val="0"/>
+          <w:i/>
+          <w:strike w:val="0"/>
+        </w:rPr>
+        <w:t>If the door is broken, my key to the wall goes to the Dhammapala. The four stand down. No contact until she names the next door.</w:t>
       </w:r>
     </w:p>
     <w:p>
@@ -1073,7 +1101,7 @@
           <w:i w:val="0"/>
           <w:strike w:val="0"/>
         </w:rPr>
-        <w:t>She bent and put the lamp out the old way, two fingers to the wick, no hurry. The smoke went up straight in the dark, with no breath left in the room to lean it anywhere.</w:t>
+        <w:t>"Yes," she said. She held the corner to the flame until the line was gone, then bent and put the lamp out the old way, two fingers to the wick, no hurry. The smoke went up straight in the dark. Neither of them breathed on it.</w:t>
       </w:r>
     </w:p>
     <w:sectPr>

</xml_diff>

<commit_message>
Ch16 round 4: final line fixes (Elara exposed, Ravi at her elbow, Rohan's reasons)
Co-Authored-By: Claude Opus 5.5 <noreply@anthropic.com>
</commit_message>
<xml_diff>
--- a/claude-notes/manuscript-v2/16-then-the-fourth-instance-merged.docx
+++ b/claude-notes/manuscript-v2/16-then-the-fourth-instance-merged.docx
@@ -113,7 +113,7 @@
           <w:i w:val="0"/>
           <w:strike w:val="0"/>
         </w:rPr>
-        <w:t>Beside the door stood a grey steel locker with a slot for each wrist. Five other terminals already lay in their slots. Elara unbuckled hers and laid it in, and the drawer closed on it with a soft pneumatic sigh. The skin where it had sat was paler than the rest of her arm, and cold. The city couldn't hear her.</w:t>
+        <w:t>Beside the door stood a grey steel locker with a slot for each wrist. Four other terminals already lay in their slots. Rohan sealed his first. Elara unbuckled hers and laid it in beside his, and the drawer closed on it with a soft pneumatic sigh. The skin where it had sat was paler than the rest of her arm, and cold. The city couldn't hear her.</w:t>
       </w:r>
     </w:p>
     <w:p>
@@ -301,7 +301,7 @@
           <w:i w:val="0"/>
           <w:strike w:val="0"/>
         </w:rPr>
-        <w:t>Baju let out one breath through his nose. She was slow to place it as a laugh. Something in the air let out a notch.</w:t>
+        <w:t>Baju let out one breath through his nose. Elara was slow to place it as a laugh. Something in the air let out a notch.</w:t>
       </w:r>
     </w:p>
     <w:p>
@@ -321,7 +321,7 @@
           <w:i w:val="0"/>
           <w:strike w:val="0"/>
         </w:rPr>
-        <w:t>"They don't know each other's true names," Rohan said. "Or their units. To each other they're the eye, the arm, the ear and the tongue, and the four together are the body. This is the only hour they'll ever share a room. After today, if one is caught, all they can give up is three faces, three nicknames, and me."</w:t>
+        <w:t>"They don't know each other's true names," Rohan said. "Or their units. To each other they're the eye, the arm, the ear and the tongue, and the four together are the body. This is the only hour they'll ever share a room. After today, if one is caught, all they can give up is three faces, three nicknames, me, and you. Which is why you were never here."</w:t>
       </w:r>
     </w:p>
     <w:p>
@@ -491,27 +491,7 @@
           <w:i w:val="0"/>
           <w:strike w:val="0"/>
         </w:rPr>
-        <w:t>She had brought her own instrument: the Sākṣī mirrors, witness copies of the city's records, kept in a separate archive by hands that had no part in the originals. Anandi had taught her to read them. An altered record could be checked against its mirror, which still held what the original used to say.</w:t>
-      </w:r>
-    </w:p>
-    <w:p>
-      <w:r>
-        <w:rPr>
-          <w:b w:val="0"/>
-          <w:i w:val="0"/>
-          <w:strike w:val="0"/>
-        </w:rPr>
-        <w:t>Since the Initiation she had been watching one narrow band: cross-house allocations, the entries where one gana's money paid for another gana's wants. The doubled transfer had come through there. So she watched for money arriving where nobody had asked for it.</w:t>
-      </w:r>
-    </w:p>
-    <w:p>
-      <w:r>
-        <w:rPr>
-          <w:b w:val="0"/>
-          <w:i w:val="0"/>
-          <w:strike w:val="0"/>
-        </w:rPr>
-        <w:t>Her terminal sat in the locker by the door. She hadn't needed it. Nayan had been watching the same water on paper.</w:t>
+        <w:t>She had brought the Sākṣī mirrors. Since the Initiation she had watched one narrow band, cross-house allocations, for money arriving where nobody had asked for it. Nayan, on paper, had been watching the same water.</w:t>
       </w:r>
     </w:p>
     <w:p>
@@ -601,7 +581,7 @@
           <w:i w:val="0"/>
           <w:strike w:val="0"/>
         </w:rPr>
-        <w:t>She had caught that analyst's wrist once, at the Initiation consoles, when his hand went toward the High Command button.</w:t>
+        <w:t>She had caught that analyst's wrist once, at the Initiation consoles, when his hand went toward the High Command button. He had sat at her elbow, at EVENT, while her console was pushed to its ceiling.</w:t>
       </w:r>
     </w:p>
     <w:p>
@@ -637,7 +617,7 @@
           <w:i w:val="0"/>
           <w:strike w:val="0"/>
         </w:rPr>
-        <w:t>"Kaan watches him clean," he said. "Whatever any of us thinks we know."</w:t>
+        <w:t>"Kaan watches him clean," he said. "Hand him your opinion of the man, and he'll see what you saw. Tell me afterward."</w:t>
       </w:r>
     </w:p>
     <w:p>
@@ -708,6 +688,16 @@
           <w:strike w:val="0"/>
         </w:rPr>
         <w:t>"Or the calibration is the one we don't understand yet," Elara said.</w:t>
+      </w:r>
+    </w:p>
+    <w:p>
+      <w:r>
+        <w:rPr>
+          <w:b w:val="0"/>
+          <w:i w:val="0"/>
+          <w:strike w:val="0"/>
+        </w:rPr>
+        <w:t>"Then it stays on the wall until we do," Rohan said.</w:t>
       </w:r>
     </w:p>
     <w:p>
@@ -883,7 +873,7 @@
           <w:i w:val="0"/>
           <w:strike w:val="0"/>
         </w:rPr>
-        <w:t>"Jeebh. Cover. From tomorrow, Drona's procedural review of Ashoka grows three sub-audits so dull no one reads past the titles. And a rumor in the right canteens: the Annex was eleven years of quiet lobbying finally landing."</w:t>
+        <w:t>"Jeebh. Cover. From tomorrow, the procedural review grows three sub-audits so dull no one reads past the titles. And a rumor in the right canteens: the Annex was eleven years of quiet lobbying finally landing."</w:t>
       </w:r>
     </w:p>
     <w:p>
@@ -963,7 +953,7 @@
           <w:i w:val="0"/>
           <w:strike w:val="0"/>
         </w:rPr>
-        <w:t>He reported the way he fought, with nothing wasted. Last, the bulletin.</w:t>
+        <w:t>He reported in order, nothing wasted, and kept the bulletin for last.</w:t>
       </w:r>
     </w:p>
     <w:p>
@@ -1003,7 +993,7 @@
           <w:i w:val="0"/>
           <w:strike w:val="0"/>
         </w:rPr>
-        <w:t>"The eye corrected us. We have a signature and a style. We do not have a body. Inside that room it is the hand, and it is an it, until the evidence says otherwise."</w:t>
+        <w:t>"The eye corrected us."</w:t>
       </w:r>
     </w:p>
     <w:p>

</xml_diff>

<commit_message>
Ch16 round 5: final line fixes (rule kept, Baju's count, transfer direction)
Co-Authored-By: Claude Opus 5.5 <noreply@anthropic.com>
</commit_message>
<xml_diff>
--- a/claude-notes/manuscript-v2/16-then-the-fourth-instance-merged.docx
+++ b/claude-notes/manuscript-v2/16-then-the-fourth-instance-merged.docx
@@ -221,7 +221,7 @@
           <w:i w:val="0"/>
           <w:strike w:val="0"/>
         </w:rPr>
-        <w:t>"Seal's good." Baju took his hand off the door and wiped it on his trousers, though there was nothing on it. "Field work. Doors, lifts, platforms. I walk what the logs say was walked, and I count." He patted the pocket. It clicked again. "Machines can be told what to remember."</w:t>
+        <w:t>"Seal's good." Baju took his hand off the door and wiped it on his trousers, though there was nothing on it. "Field work. Doors, lifts, platforms. I walk what the logs say was walked, and I count." He patted the pocket. It clicked again. "A log says I walked it. My knees say whether I did."</w:t>
       </w:r>
     </w:p>
     <w:p>
@@ -321,7 +321,7 @@
           <w:i w:val="0"/>
           <w:strike w:val="0"/>
         </w:rPr>
-        <w:t>"They don't know each other's true names," Rohan said. "Or their units. To each other they're the eye, the arm, the ear and the tongue, and the four together are the body. This is the only hour they'll ever share a room. After today, if one is caught, all they can give up is three faces, three nicknames, me, and you. Which is why you were never here."</w:t>
+        <w:t>"They don't know each other's true names," Rohan said. "Or their units. To each other they're the eye, the arm, the ear and the tongue, and the four together are the body. This is the only hour they'll ever share a room. After today, if one is caught, all they can give up is three faces, three nicknames, and me. They never heard your name. Keep it that way."</w:t>
       </w:r>
     </w:p>
     <w:p>
@@ -381,7 +381,7 @@
           <w:i w:val="0"/>
           <w:strike w:val="0"/>
         </w:rPr>
-        <w:t>Her thumb pressed into the soft edge of the pad until it dented. She didn't answer, which was the answer.</w:t>
+        <w:t>Her thumb pressed into the soft edge of the pad until it dented. She didn't answer.</w:t>
       </w:r>
     </w:p>
     <w:p>
@@ -491,7 +491,7 @@
           <w:i w:val="0"/>
           <w:strike w:val="0"/>
         </w:rPr>
-        <w:t>She had brought the Sākṣī mirrors. Since the Initiation she had watched one narrow band, cross-house allocations, for money arriving where nobody had asked for it. Nayan, on paper, had been watching the same water.</w:t>
+        <w:t>She had brought the Sākṣī mirrors, copied out by hand, two nights' work, because nothing with a thread crossed that door. Since the Initiation she had watched one narrow band, cross-house allocations, for money arriving where nobody had asked for it. Nayan, on paper, had been watching the same water.</w:t>
       </w:r>
     </w:p>
     <w:p>
@@ -637,7 +637,7 @@
           <w:i w:val="0"/>
           <w:strike w:val="0"/>
         </w:rPr>
-        <w:t>Elara closed her mouth on the name and sat back. Her thumb found the dent it had made in the pad. An hour ago the rule had cost her nothing.</w:t>
+        <w:t>Elara closed her mouth on the name and sat back. Her thumb found the dent it had made in the pad. An hour ago she had argued with the rule. Now she was keeping it.</w:t>
       </w:r>
     </w:p>
     <w:p>
@@ -783,7 +783,7 @@
           <w:i w:val="0"/>
           <w:strike w:val="0"/>
         </w:rPr>
-        <w:t>"If you are right," Rohan said, "then the pattern has a fourth instance. And look at the date. The first three happened weeks and months ago. This one happened this morning, while we were pinning the other three to a wall." His jaw worked once along the old scar. "We came here to read history. This is traffic. It is still moving."</w:t>
+        <w:t>"If you are right," Rohan said, "then the pattern has a fourth instance. And look at the date. The first three happened weeks and months ago. This one happened this morning, while we sat looking at the other three." His jaw worked once along the old scar. "We came here to read history. This is traffic. It is still moving."</w:t>
       </w:r>
     </w:p>
     <w:p>
@@ -843,7 +843,7 @@
           <w:i w:val="0"/>
           <w:strike w:val="0"/>
         </w:rPr>
-        <w:t>"Four instances, six days either side of each. Forty-eight days of door logs," Baju said. "Two weeks to walk them. If nothing bent, that's the worse answer."</w:t>
+        <w:t>"Three instances, six days either side of each, and the six before this morning. Forty-two days of door logs," Baju said. "Two weeks to walk them. If nothing bent, that's the worse answer."</w:t>
       </w:r>
     </w:p>
     <w:p>
@@ -913,7 +913,7 @@
           <w:i w:val="0"/>
           <w:strike w:val="0"/>
         </w:rPr>
-        <w:t>"Same direction as the other three. Same disguise. Same perfection." He looked at the bare stretch of wall beside the third panel. "Fourth instance. Fourth panel."</w:t>
+        <w:t>"Same disguise. Same perfection. Same direction as the transfer." He looked at the bare stretch of wall beside the third panel. "Fourth instance. Fourth panel."</w:t>
       </w:r>
     </w:p>
     <w:p>

</xml_diff>

<commit_message>
Ch16 round 6: cut the L169 maxim; Nayan supplies the rotation; Rohan's roster line
Co-Authored-By: Claude Opus 5.5 <noreply@anthropic.com>
</commit_message>
<xml_diff>
--- a/claude-notes/manuscript-v2/16-then-the-fourth-instance-merged.docx
+++ b/claude-notes/manuscript-v2/16-then-the-fourth-instance-merged.docx
@@ -73,7 +73,7 @@
           <w:i w:val="0"/>
           <w:strike w:val="0"/>
         </w:rPr>
-        <w:t>"And a borrowed room between the platforms would be worse." Rohan didn't slow. "An empty room protects you from people. Nothing about it protects you from systems. Two officials meeting off their routes is exactly what a watching system is built to flag. The safest place to stand is inside your own lawful shadow. You're a Drona representative conducting a procedural review with Ashoka, under the Ancient One's code."</w:t>
+        <w:t>"And a borrowed room between the platforms would be worse." Rohan didn't slow. "An empty room protects you from people. Nothing about it protects you from systems. Two officials meeting off their routes is exactly what a watching system is built to flag. The safest place to stand is inside your own lawful shadow. You're Drona, on a procedural review with Ashoka under the Ancient One's code. That's on the roster. Nobody flags a roster."</w:t>
       </w:r>
     </w:p>
     <w:p>
@@ -561,7 +561,7 @@
           <w:i w:val="0"/>
           <w:strike w:val="0"/>
         </w:rPr>
-        <w:t>"The council acted on a memorandum," Nayan said. "Cost of Chanakya's retrieval delays. Signed by an analyst named Ravi. EVENT rotation, last Initiation." She checked the sheet. "Bulletin calls it exemplary. Every figure sourced. Every objection anticipated. Eleven years of refusal answered in nine pages."</w:t>
+        <w:t>"The council acted on a memorandum," Nayan said. "Cost of Chanakya's retrieval delays. Signed by an analyst named Ravi." She pulled a dated sheet from the stack at her elbow without looking. "EVENT rotation, last Initiation." She went back to the bulletin. "Every figure sourced. Every objection anticipated. Eleven years of refusal answered in nine pages."</w:t>
       </w:r>
     </w:p>
     <w:p>
@@ -893,7 +893,7 @@
           <w:i w:val="0"/>
           <w:strike w:val="0"/>
         </w:rPr>
-        <w:t>"The hand's whole art is dressing the extraordinary as the ordinary," Rohan said. "A theft as a gift. An order as a habit. Whatever you do tomorrow, make sure it looks like nothing."</w:t>
+        <w:t>"Whatever you do tomorrow, make sure it looks like nothing," Rohan said.</w:t>
       </w:r>
     </w:p>
     <w:p>

</xml_diff>

<commit_message>
Ch16 round 7: memo and roster sourced; dent beat shown; Kaan line clarified
Co-Authored-By: Claude Opus 5.5 <noreply@anthropic.com>
</commit_message>
<xml_diff>
--- a/claude-notes/manuscript-v2/16-then-the-fourth-instance-merged.docx
+++ b/claude-notes/manuscript-v2/16-then-the-fourth-instance-merged.docx
@@ -431,7 +431,7 @@
           <w:i w:val="0"/>
           <w:strike w:val="0"/>
         </w:rPr>
-        <w:t>The transfer that had doubled in flight, which no one had requested and no one had granted. The signature of two letters the system obeyed without being able to name. The calibration pushed to its ceiling through Elara's own console during the Initiation, by a hand no inquiry had found.</w:t>
+        <w:t>The transfer that had doubled in flight, which no one had requested and no one had granted. The signature of two letters the system obeyed without being able to name. The calibration pushed to its ceiling through a Drona console during the Initiation, by a hand no inquiry had found.</w:t>
       </w:r>
     </w:p>
     <w:p>
@@ -561,7 +561,7 @@
           <w:i w:val="0"/>
           <w:strike w:val="0"/>
         </w:rPr>
-        <w:t>"The council acted on a memorandum," Nayan said. "Cost of Chanakya's retrieval delays. Signed by an analyst named Ravi." She pulled a dated sheet from the stack at her elbow without looking. "EVENT rotation, last Initiation." She went back to the bulletin. "Every figure sourced. Every objection anticipated. Eleven years of refusal answered in nine pages."</w:t>
+        <w:t>"The council acted on a memorandum," Nayan said. "Cost of Chanakya's retrieval delays. Signed by an analyst named Ravi." She pulled a dated copy of the Initiation roster from the stack at her elbow without looking. "EVENT rotation, last Initiation." She went back to the bulletin and the pages clipped behind it. "My runner copied the memorandum too. A full grant publishes its basis. Every figure sourced. Every objection anticipated. Eleven years of refusal answered in nine pages."</w:t>
       </w:r>
     </w:p>
     <w:p>
@@ -617,7 +617,7 @@
           <w:i w:val="0"/>
           <w:strike w:val="0"/>
         </w:rPr>
-        <w:t>"Kaan watches him clean," he said. "Hand him your opinion of the man, and he'll see what you saw. Tell me afterward."</w:t>
+        <w:t>"Kaan watches him clean," he said. "Give him your opinion of the man and he'll only ever see what you saw. Tell me afterward."</w:t>
       </w:r>
     </w:p>
     <w:p>
@@ -637,7 +637,7 @@
           <w:i w:val="0"/>
           <w:strike w:val="0"/>
         </w:rPr>
-        <w:t>Elara closed her mouth on the name and sat back. Her thumb found the dent it had made in the pad. An hour ago she had argued with the rule. Now she was keeping it.</w:t>
+        <w:t>Elara closed her mouth on the name and sat back. Her thumb found the dent it had made in the pad and stayed there. Rohan did not look at her, which was how she knew he was sorry.</w:t>
       </w:r>
     </w:p>
     <w:p>

</xml_diff>